<commit_message>
Remove broken HTML submodule
</commit_message>
<xml_diff>
--- a/Word/3_5 DATA afr/PUG_Application.docx
+++ b/Word/3_5 DATA afr/PUG_Application.docx
@@ -1,6 +1,6 @@
 
 <file path=word/document.xml><?xml version="1.0" encoding="utf-8"?>
-<w:document xmlns:wpc="http://schemas.microsoft.com/office/word/2010/wordprocessingCanvas" xmlns:cx="http://schemas.microsoft.com/office/drawing/2014/chartex" xmlns:cx1="http://schemas.microsoft.com/office/drawing/2015/9/8/chartex" xmlns:cx2="http://schemas.microsoft.com/office/drawing/2015/10/21/chartex" xmlns:mc="http://schemas.openxmlformats.org/markup-compatibility/2006" xmlns:o="urn:schemas-microsoft-com:office:office" xmlns:r="http://schemas.openxmlformats.org/officeDocument/2006/relationships" xmlns:m="http://schemas.openxmlformats.org/officeDocument/2006/math" xmlns:v="urn:schemas-microsoft-com:vml" xmlns:wp14="http://schemas.microsoft.com/office/word/2010/wordprocessingDrawing" xmlns:wp="http://schemas.openxmlformats.org/drawingml/2006/wordprocessingDrawing" xmlns:w10="urn:schemas-microsoft-com:office:word" xmlns:w="http://schemas.openxmlformats.org/wordprocessingml/2006/main" xmlns:w14="http://schemas.microsoft.com/office/word/2010/wordml" xmlns:w15="http://schemas.microsoft.com/office/word/2012/wordml" xmlns:w16se="http://schemas.microsoft.com/office/word/2015/wordml/symex" xmlns:wpg="http://schemas.microsoft.com/office/word/2010/wordprocessingGroup" xmlns:wpi="http://schemas.microsoft.com/office/word/2010/wordprocessingInk" xmlns:wne="http://schemas.microsoft.com/office/word/2006/wordml" xmlns:wps="http://schemas.microsoft.com/office/word/2010/wordprocessingShape" mc:Ignorable="w14 w15 w16se wp14">
+<w:document xmlns:wpc="http://schemas.microsoft.com/office/word/2010/wordprocessingCanvas" xmlns:cx="http://schemas.microsoft.com/office/drawing/2014/chartex" xmlns:cx1="http://schemas.microsoft.com/office/drawing/2015/9/8/chartex" xmlns:mc="http://schemas.openxmlformats.org/markup-compatibility/2006" xmlns:o="urn:schemas-microsoft-com:office:office" xmlns:r="http://schemas.openxmlformats.org/officeDocument/2006/relationships" xmlns:m="http://schemas.openxmlformats.org/officeDocument/2006/math" xmlns:v="urn:schemas-microsoft-com:vml" xmlns:wp14="http://schemas.microsoft.com/office/word/2010/wordprocessingDrawing" xmlns:wp="http://schemas.openxmlformats.org/drawingml/2006/wordprocessingDrawing" xmlns:w10="urn:schemas-microsoft-com:office:word" xmlns:w="http://schemas.openxmlformats.org/wordprocessingml/2006/main" xmlns:w14="http://schemas.microsoft.com/office/word/2010/wordml" xmlns:w15="http://schemas.microsoft.com/office/word/2012/wordml" xmlns:w16se="http://schemas.microsoft.com/office/word/2015/wordml/symex" xmlns:wpg="http://schemas.microsoft.com/office/word/2010/wordprocessingGroup" xmlns:wpi="http://schemas.microsoft.com/office/word/2010/wordprocessingInk" xmlns:wne="http://schemas.microsoft.com/office/word/2006/wordml" xmlns:wps="http://schemas.microsoft.com/office/word/2010/wordprocessingShape" mc:Ignorable="w14 w15 w16se wp14">
   <w:body>
     <w:p>
       <w:pPr>
@@ -88,6 +88,14 @@
           <w:szCs w:val="32"/>
         </w:rPr>
         <w:br/>
+      </w:r>
+      <w:bookmarkStart w:id="0" w:name="_GoBack"/>
+      <w:r>
+        <w:rPr>
+          <w:b/>
+          <w:sz w:val="32"/>
+          <w:szCs w:val="32"/>
+        </w:rPr>
         <w:t>OF THE PUG CLUB</w:t>
       </w:r>
     </w:p>
@@ -119,6 +127,7 @@
         <w:t>TELEPHONE (cell) E-MAIL ADDRESS</w:t>
       </w:r>
     </w:p>
+    <w:bookmarkEnd w:id="0"/>
     <w:p>
       <w:pPr>
         <w:spacing w:before="360"/>
@@ -138,8 +147,13 @@
     </w:p>
     <w:p>
       <w:r>
-        <w:t>STATE BELOW YOUR INTEREST IN THE BREED AND HOW THIS CAME ABOUT</w:t>
-      </w:r>
+        <w:t xml:space="preserve">STATE BELOW YOUR INTEREST IN </w:t>
+      </w:r>
+      <w:proofErr w:type="gramStart"/>
+      <w:r>
+        <w:t>THE BREED AND HOW THIS CAME ABOUT</w:t>
+      </w:r>
+      <w:proofErr w:type="gramEnd"/>
     </w:p>
     <w:p>
       <w:pPr>
@@ -173,8 +187,6 @@
       <w:r>
         <w:t xml:space="preserve"> THE CLUB, e.g. publicity, fund</w:t>
       </w:r>
-      <w:bookmarkStart w:id="0" w:name="_GoBack"/>
-      <w:bookmarkEnd w:id="0"/>
       <w:r>
         <w:t>raising, etc.</w:t>
       </w:r>
@@ -199,7 +211,21 @@
         <w:rPr>
           <w:i/>
         </w:rPr>
-        <w:t>Please return this form and post or fax to:</w:t>
+        <w:t xml:space="preserve">Please return this form and post or fax </w:t>
+      </w:r>
+      <w:proofErr w:type="gramStart"/>
+      <w:r>
+        <w:rPr>
+          <w:i/>
+        </w:rPr>
+        <w:t>to</w:t>
+      </w:r>
+      <w:proofErr w:type="gramEnd"/>
+      <w:r>
+        <w:rPr>
+          <w:i/>
+        </w:rPr>
+        <w:t>:</w:t>
       </w:r>
     </w:p>
     <w:p>
@@ -218,9 +244,11 @@
       </w:r>
     </w:p>
     <w:p>
+      <w:proofErr w:type="spellStart"/>
       <w:r>
         <w:t>Bloubergrant</w:t>
       </w:r>
+      <w:proofErr w:type="spellEnd"/>
     </w:p>
     <w:p>
       <w:r>
@@ -250,7 +278,7 @@
 </file>
 
 <file path=word/endnotes.xml><?xml version="1.0" encoding="utf-8"?>
-<w:endnotes xmlns:wpc="http://schemas.microsoft.com/office/word/2010/wordprocessingCanvas" xmlns:cx="http://schemas.microsoft.com/office/drawing/2014/chartex" xmlns:cx1="http://schemas.microsoft.com/office/drawing/2015/9/8/chartex" xmlns:cx2="http://schemas.microsoft.com/office/drawing/2015/10/21/chartex" xmlns:mc="http://schemas.openxmlformats.org/markup-compatibility/2006" xmlns:o="urn:schemas-microsoft-com:office:office" xmlns:r="http://schemas.openxmlformats.org/officeDocument/2006/relationships" xmlns:m="http://schemas.openxmlformats.org/officeDocument/2006/math" xmlns:v="urn:schemas-microsoft-com:vml" xmlns:wp14="http://schemas.microsoft.com/office/word/2010/wordprocessingDrawing" xmlns:wp="http://schemas.openxmlformats.org/drawingml/2006/wordprocessingDrawing" xmlns:w10="urn:schemas-microsoft-com:office:word" xmlns:w="http://schemas.openxmlformats.org/wordprocessingml/2006/main" xmlns:w14="http://schemas.microsoft.com/office/word/2010/wordml" xmlns:w15="http://schemas.microsoft.com/office/word/2012/wordml" xmlns:w16se="http://schemas.microsoft.com/office/word/2015/wordml/symex" xmlns:wpg="http://schemas.microsoft.com/office/word/2010/wordprocessingGroup" xmlns:wpi="http://schemas.microsoft.com/office/word/2010/wordprocessingInk" xmlns:wne="http://schemas.microsoft.com/office/word/2006/wordml" xmlns:wps="http://schemas.microsoft.com/office/word/2010/wordprocessingShape" mc:Ignorable="w14 w15 w16se wp14">
+<w:endnotes xmlns:wpc="http://schemas.microsoft.com/office/word/2010/wordprocessingCanvas" xmlns:cx="http://schemas.microsoft.com/office/drawing/2014/chartex" xmlns:cx1="http://schemas.microsoft.com/office/drawing/2015/9/8/chartex" xmlns:mc="http://schemas.openxmlformats.org/markup-compatibility/2006" xmlns:o="urn:schemas-microsoft-com:office:office" xmlns:r="http://schemas.openxmlformats.org/officeDocument/2006/relationships" xmlns:m="http://schemas.openxmlformats.org/officeDocument/2006/math" xmlns:v="urn:schemas-microsoft-com:vml" xmlns:wp14="http://schemas.microsoft.com/office/word/2010/wordprocessingDrawing" xmlns:wp="http://schemas.openxmlformats.org/drawingml/2006/wordprocessingDrawing" xmlns:w10="urn:schemas-microsoft-com:office:word" xmlns:w="http://schemas.openxmlformats.org/wordprocessingml/2006/main" xmlns:w14="http://schemas.microsoft.com/office/word/2010/wordml" xmlns:w15="http://schemas.microsoft.com/office/word/2012/wordml" xmlns:w16se="http://schemas.microsoft.com/office/word/2015/wordml/symex" xmlns:wpg="http://schemas.microsoft.com/office/word/2010/wordprocessingGroup" xmlns:wpi="http://schemas.microsoft.com/office/word/2010/wordprocessingInk" xmlns:wne="http://schemas.microsoft.com/office/word/2006/wordml" xmlns:wps="http://schemas.microsoft.com/office/word/2010/wordprocessingShape" mc:Ignorable="w14 w15 w16se wp14">
   <w:endnote w:type="separator" w:id="-1">
     <w:p>
       <w:pPr>
@@ -275,7 +303,7 @@
 </file>
 
 <file path=word/footer1.xml><?xml version="1.0" encoding="utf-8"?>
-<w:ftr xmlns:wpc="http://schemas.microsoft.com/office/word/2010/wordprocessingCanvas" xmlns:cx="http://schemas.microsoft.com/office/drawing/2014/chartex" xmlns:cx1="http://schemas.microsoft.com/office/drawing/2015/9/8/chartex" xmlns:cx2="http://schemas.microsoft.com/office/drawing/2015/10/21/chartex" xmlns:mc="http://schemas.openxmlformats.org/markup-compatibility/2006" xmlns:o="urn:schemas-microsoft-com:office:office" xmlns:r="http://schemas.openxmlformats.org/officeDocument/2006/relationships" xmlns:m="http://schemas.openxmlformats.org/officeDocument/2006/math" xmlns:v="urn:schemas-microsoft-com:vml" xmlns:wp14="http://schemas.microsoft.com/office/word/2010/wordprocessingDrawing" xmlns:wp="http://schemas.openxmlformats.org/drawingml/2006/wordprocessingDrawing" xmlns:w10="urn:schemas-microsoft-com:office:word" xmlns:w="http://schemas.openxmlformats.org/wordprocessingml/2006/main" xmlns:w14="http://schemas.microsoft.com/office/word/2010/wordml" xmlns:w15="http://schemas.microsoft.com/office/word/2012/wordml" xmlns:w16se="http://schemas.microsoft.com/office/word/2015/wordml/symex" xmlns:wpg="http://schemas.microsoft.com/office/word/2010/wordprocessingGroup" xmlns:wpi="http://schemas.microsoft.com/office/word/2010/wordprocessingInk" xmlns:wne="http://schemas.microsoft.com/office/word/2006/wordml" xmlns:wps="http://schemas.microsoft.com/office/word/2010/wordprocessingShape" mc:Ignorable="w14 w15 w16se wp14">
+<w:ftr xmlns:wpc="http://schemas.microsoft.com/office/word/2010/wordprocessingCanvas" xmlns:cx="http://schemas.microsoft.com/office/drawing/2014/chartex" xmlns:cx1="http://schemas.microsoft.com/office/drawing/2015/9/8/chartex" xmlns:mc="http://schemas.openxmlformats.org/markup-compatibility/2006" xmlns:o="urn:schemas-microsoft-com:office:office" xmlns:r="http://schemas.openxmlformats.org/officeDocument/2006/relationships" xmlns:m="http://schemas.openxmlformats.org/officeDocument/2006/math" xmlns:v="urn:schemas-microsoft-com:vml" xmlns:wp14="http://schemas.microsoft.com/office/word/2010/wordprocessingDrawing" xmlns:wp="http://schemas.openxmlformats.org/drawingml/2006/wordprocessingDrawing" xmlns:w10="urn:schemas-microsoft-com:office:word" xmlns:w="http://schemas.openxmlformats.org/wordprocessingml/2006/main" xmlns:w14="http://schemas.microsoft.com/office/word/2010/wordml" xmlns:w15="http://schemas.microsoft.com/office/word/2012/wordml" xmlns:w16se="http://schemas.microsoft.com/office/word/2015/wordml/symex" xmlns:wpg="http://schemas.microsoft.com/office/word/2010/wordprocessingGroup" xmlns:wpi="http://schemas.microsoft.com/office/word/2010/wordprocessingInk" xmlns:wne="http://schemas.microsoft.com/office/word/2006/wordml" xmlns:wps="http://schemas.microsoft.com/office/word/2010/wordprocessingShape" mc:Ignorable="w14 w15 w16se wp14">
   <w:p>
     <w:pPr>
       <w:pStyle w:val="Footer"/>
@@ -285,7 +313,7 @@
 </file>
 
 <file path=word/footer2.xml><?xml version="1.0" encoding="utf-8"?>
-<w:ftr xmlns:wpc="http://schemas.microsoft.com/office/word/2010/wordprocessingCanvas" xmlns:cx="http://schemas.microsoft.com/office/drawing/2014/chartex" xmlns:cx1="http://schemas.microsoft.com/office/drawing/2015/9/8/chartex" xmlns:cx2="http://schemas.microsoft.com/office/drawing/2015/10/21/chartex" xmlns:mc="http://schemas.openxmlformats.org/markup-compatibility/2006" xmlns:o="urn:schemas-microsoft-com:office:office" xmlns:r="http://schemas.openxmlformats.org/officeDocument/2006/relationships" xmlns:m="http://schemas.openxmlformats.org/officeDocument/2006/math" xmlns:v="urn:schemas-microsoft-com:vml" xmlns:wp14="http://schemas.microsoft.com/office/word/2010/wordprocessingDrawing" xmlns:wp="http://schemas.openxmlformats.org/drawingml/2006/wordprocessingDrawing" xmlns:w10="urn:schemas-microsoft-com:office:word" xmlns:w="http://schemas.openxmlformats.org/wordprocessingml/2006/main" xmlns:w14="http://schemas.microsoft.com/office/word/2010/wordml" xmlns:w15="http://schemas.microsoft.com/office/word/2012/wordml" xmlns:w16se="http://schemas.microsoft.com/office/word/2015/wordml/symex" xmlns:wpg="http://schemas.microsoft.com/office/word/2010/wordprocessingGroup" xmlns:wpi="http://schemas.microsoft.com/office/word/2010/wordprocessingInk" xmlns:wne="http://schemas.microsoft.com/office/word/2006/wordml" xmlns:wps="http://schemas.microsoft.com/office/word/2010/wordprocessingShape" mc:Ignorable="w14 w15 w16se wp14">
+<w:ftr xmlns:wpc="http://schemas.microsoft.com/office/word/2010/wordprocessingCanvas" xmlns:cx="http://schemas.microsoft.com/office/drawing/2014/chartex" xmlns:cx1="http://schemas.microsoft.com/office/drawing/2015/9/8/chartex" xmlns:mc="http://schemas.openxmlformats.org/markup-compatibility/2006" xmlns:o="urn:schemas-microsoft-com:office:office" xmlns:r="http://schemas.openxmlformats.org/officeDocument/2006/relationships" xmlns:m="http://schemas.openxmlformats.org/officeDocument/2006/math" xmlns:v="urn:schemas-microsoft-com:vml" xmlns:wp14="http://schemas.microsoft.com/office/word/2010/wordprocessingDrawing" xmlns:wp="http://schemas.openxmlformats.org/drawingml/2006/wordprocessingDrawing" xmlns:w10="urn:schemas-microsoft-com:office:word" xmlns:w="http://schemas.openxmlformats.org/wordprocessingml/2006/main" xmlns:w14="http://schemas.microsoft.com/office/word/2010/wordml" xmlns:w15="http://schemas.microsoft.com/office/word/2012/wordml" xmlns:w16se="http://schemas.microsoft.com/office/word/2015/wordml/symex" xmlns:wpg="http://schemas.microsoft.com/office/word/2010/wordprocessingGroup" xmlns:wpi="http://schemas.microsoft.com/office/word/2010/wordprocessingInk" xmlns:wne="http://schemas.microsoft.com/office/word/2006/wordml" xmlns:wps="http://schemas.microsoft.com/office/word/2010/wordprocessingShape" mc:Ignorable="w14 w15 w16se wp14">
   <w:p>
     <w:pPr>
       <w:pStyle w:val="Footer"/>
@@ -295,7 +323,7 @@
 </file>
 
 <file path=word/footer3.xml><?xml version="1.0" encoding="utf-8"?>
-<w:ftr xmlns:wpc="http://schemas.microsoft.com/office/word/2010/wordprocessingCanvas" xmlns:cx="http://schemas.microsoft.com/office/drawing/2014/chartex" xmlns:cx1="http://schemas.microsoft.com/office/drawing/2015/9/8/chartex" xmlns:cx2="http://schemas.microsoft.com/office/drawing/2015/10/21/chartex" xmlns:mc="http://schemas.openxmlformats.org/markup-compatibility/2006" xmlns:o="urn:schemas-microsoft-com:office:office" xmlns:r="http://schemas.openxmlformats.org/officeDocument/2006/relationships" xmlns:m="http://schemas.openxmlformats.org/officeDocument/2006/math" xmlns:v="urn:schemas-microsoft-com:vml" xmlns:wp14="http://schemas.microsoft.com/office/word/2010/wordprocessingDrawing" xmlns:wp="http://schemas.openxmlformats.org/drawingml/2006/wordprocessingDrawing" xmlns:w10="urn:schemas-microsoft-com:office:word" xmlns:w="http://schemas.openxmlformats.org/wordprocessingml/2006/main" xmlns:w14="http://schemas.microsoft.com/office/word/2010/wordml" xmlns:w15="http://schemas.microsoft.com/office/word/2012/wordml" xmlns:w16se="http://schemas.microsoft.com/office/word/2015/wordml/symex" xmlns:wpg="http://schemas.microsoft.com/office/word/2010/wordprocessingGroup" xmlns:wpi="http://schemas.microsoft.com/office/word/2010/wordprocessingInk" xmlns:wne="http://schemas.microsoft.com/office/word/2006/wordml" xmlns:wps="http://schemas.microsoft.com/office/word/2010/wordprocessingShape" mc:Ignorable="w14 w15 w16se wp14">
+<w:ftr xmlns:wpc="http://schemas.microsoft.com/office/word/2010/wordprocessingCanvas" xmlns:cx="http://schemas.microsoft.com/office/drawing/2014/chartex" xmlns:cx1="http://schemas.microsoft.com/office/drawing/2015/9/8/chartex" xmlns:mc="http://schemas.openxmlformats.org/markup-compatibility/2006" xmlns:o="urn:schemas-microsoft-com:office:office" xmlns:r="http://schemas.openxmlformats.org/officeDocument/2006/relationships" xmlns:m="http://schemas.openxmlformats.org/officeDocument/2006/math" xmlns:v="urn:schemas-microsoft-com:vml" xmlns:wp14="http://schemas.microsoft.com/office/word/2010/wordprocessingDrawing" xmlns:wp="http://schemas.openxmlformats.org/drawingml/2006/wordprocessingDrawing" xmlns:w10="urn:schemas-microsoft-com:office:word" xmlns:w="http://schemas.openxmlformats.org/wordprocessingml/2006/main" xmlns:w14="http://schemas.microsoft.com/office/word/2010/wordml" xmlns:w15="http://schemas.microsoft.com/office/word/2012/wordml" xmlns:w16se="http://schemas.microsoft.com/office/word/2015/wordml/symex" xmlns:wpg="http://schemas.microsoft.com/office/word/2010/wordprocessingGroup" xmlns:wpi="http://schemas.microsoft.com/office/word/2010/wordprocessingInk" xmlns:wne="http://schemas.microsoft.com/office/word/2006/wordml" xmlns:wps="http://schemas.microsoft.com/office/word/2010/wordprocessingShape" mc:Ignorable="w14 w15 w16se wp14">
   <w:p>
     <w:pPr>
       <w:pStyle w:val="Footer"/>
@@ -305,7 +333,7 @@
 </file>
 
 <file path=word/footnotes.xml><?xml version="1.0" encoding="utf-8"?>
-<w:footnotes xmlns:wpc="http://schemas.microsoft.com/office/word/2010/wordprocessingCanvas" xmlns:cx="http://schemas.microsoft.com/office/drawing/2014/chartex" xmlns:cx1="http://schemas.microsoft.com/office/drawing/2015/9/8/chartex" xmlns:cx2="http://schemas.microsoft.com/office/drawing/2015/10/21/chartex" xmlns:mc="http://schemas.openxmlformats.org/markup-compatibility/2006" xmlns:o="urn:schemas-microsoft-com:office:office" xmlns:r="http://schemas.openxmlformats.org/officeDocument/2006/relationships" xmlns:m="http://schemas.openxmlformats.org/officeDocument/2006/math" xmlns:v="urn:schemas-microsoft-com:vml" xmlns:wp14="http://schemas.microsoft.com/office/word/2010/wordprocessingDrawing" xmlns:wp="http://schemas.openxmlformats.org/drawingml/2006/wordprocessingDrawing" xmlns:w10="urn:schemas-microsoft-com:office:word" xmlns:w="http://schemas.openxmlformats.org/wordprocessingml/2006/main" xmlns:w14="http://schemas.microsoft.com/office/word/2010/wordml" xmlns:w15="http://schemas.microsoft.com/office/word/2012/wordml" xmlns:w16se="http://schemas.microsoft.com/office/word/2015/wordml/symex" xmlns:wpg="http://schemas.microsoft.com/office/word/2010/wordprocessingGroup" xmlns:wpi="http://schemas.microsoft.com/office/word/2010/wordprocessingInk" xmlns:wne="http://schemas.microsoft.com/office/word/2006/wordml" xmlns:wps="http://schemas.microsoft.com/office/word/2010/wordprocessingShape" mc:Ignorable="w14 w15 w16se wp14">
+<w:footnotes xmlns:wpc="http://schemas.microsoft.com/office/word/2010/wordprocessingCanvas" xmlns:cx="http://schemas.microsoft.com/office/drawing/2014/chartex" xmlns:cx1="http://schemas.microsoft.com/office/drawing/2015/9/8/chartex" xmlns:mc="http://schemas.openxmlformats.org/markup-compatibility/2006" xmlns:o="urn:schemas-microsoft-com:office:office" xmlns:r="http://schemas.openxmlformats.org/officeDocument/2006/relationships" xmlns:m="http://schemas.openxmlformats.org/officeDocument/2006/math" xmlns:v="urn:schemas-microsoft-com:vml" xmlns:wp14="http://schemas.microsoft.com/office/word/2010/wordprocessingDrawing" xmlns:wp="http://schemas.openxmlformats.org/drawingml/2006/wordprocessingDrawing" xmlns:w10="urn:schemas-microsoft-com:office:word" xmlns:w="http://schemas.openxmlformats.org/wordprocessingml/2006/main" xmlns:w14="http://schemas.microsoft.com/office/word/2010/wordml" xmlns:w15="http://schemas.microsoft.com/office/word/2012/wordml" xmlns:w16se="http://schemas.microsoft.com/office/word/2015/wordml/symex" xmlns:wpg="http://schemas.microsoft.com/office/word/2010/wordprocessingGroup" xmlns:wpi="http://schemas.microsoft.com/office/word/2010/wordprocessingInk" xmlns:wne="http://schemas.microsoft.com/office/word/2006/wordml" xmlns:wps="http://schemas.microsoft.com/office/word/2010/wordprocessingShape" mc:Ignorable="w14 w15 w16se wp14">
   <w:footnote w:type="separator" w:id="-1">
     <w:p>
       <w:pPr>
@@ -330,7 +358,7 @@
 </file>
 
 <file path=word/header1.xml><?xml version="1.0" encoding="utf-8"?>
-<w:hdr xmlns:wpc="http://schemas.microsoft.com/office/word/2010/wordprocessingCanvas" xmlns:cx="http://schemas.microsoft.com/office/drawing/2014/chartex" xmlns:cx1="http://schemas.microsoft.com/office/drawing/2015/9/8/chartex" xmlns:cx2="http://schemas.microsoft.com/office/drawing/2015/10/21/chartex" xmlns:mc="http://schemas.openxmlformats.org/markup-compatibility/2006" xmlns:o="urn:schemas-microsoft-com:office:office" xmlns:r="http://schemas.openxmlformats.org/officeDocument/2006/relationships" xmlns:m="http://schemas.openxmlformats.org/officeDocument/2006/math" xmlns:v="urn:schemas-microsoft-com:vml" xmlns:wp14="http://schemas.microsoft.com/office/word/2010/wordprocessingDrawing" xmlns:wp="http://schemas.openxmlformats.org/drawingml/2006/wordprocessingDrawing" xmlns:w10="urn:schemas-microsoft-com:office:word" xmlns:w="http://schemas.openxmlformats.org/wordprocessingml/2006/main" xmlns:w14="http://schemas.microsoft.com/office/word/2010/wordml" xmlns:w15="http://schemas.microsoft.com/office/word/2012/wordml" xmlns:w16se="http://schemas.microsoft.com/office/word/2015/wordml/symex" xmlns:wpg="http://schemas.microsoft.com/office/word/2010/wordprocessingGroup" xmlns:wpi="http://schemas.microsoft.com/office/word/2010/wordprocessingInk" xmlns:wne="http://schemas.microsoft.com/office/word/2006/wordml" xmlns:wps="http://schemas.microsoft.com/office/word/2010/wordprocessingShape" mc:Ignorable="w14 w15 w16se wp14">
+<w:hdr xmlns:wpc="http://schemas.microsoft.com/office/word/2010/wordprocessingCanvas" xmlns:cx="http://schemas.microsoft.com/office/drawing/2014/chartex" xmlns:cx1="http://schemas.microsoft.com/office/drawing/2015/9/8/chartex" xmlns:mc="http://schemas.openxmlformats.org/markup-compatibility/2006" xmlns:o="urn:schemas-microsoft-com:office:office" xmlns:r="http://schemas.openxmlformats.org/officeDocument/2006/relationships" xmlns:m="http://schemas.openxmlformats.org/officeDocument/2006/math" xmlns:v="urn:schemas-microsoft-com:vml" xmlns:wp14="http://schemas.microsoft.com/office/word/2010/wordprocessingDrawing" xmlns:wp="http://schemas.openxmlformats.org/drawingml/2006/wordprocessingDrawing" xmlns:w10="urn:schemas-microsoft-com:office:word" xmlns:w="http://schemas.openxmlformats.org/wordprocessingml/2006/main" xmlns:w14="http://schemas.microsoft.com/office/word/2010/wordml" xmlns:w15="http://schemas.microsoft.com/office/word/2012/wordml" xmlns:w16se="http://schemas.microsoft.com/office/word/2015/wordml/symex" xmlns:wpg="http://schemas.microsoft.com/office/word/2010/wordprocessingGroup" xmlns:wpi="http://schemas.microsoft.com/office/word/2010/wordprocessingInk" xmlns:wne="http://schemas.microsoft.com/office/word/2006/wordml" xmlns:wps="http://schemas.microsoft.com/office/word/2010/wordprocessingShape" mc:Ignorable="w14 w15 w16se wp14">
   <w:p>
     <w:pPr>
       <w:pStyle w:val="Header"/>
@@ -340,7 +368,7 @@
 </file>
 
 <file path=word/header2.xml><?xml version="1.0" encoding="utf-8"?>
-<w:hdr xmlns:wpc="http://schemas.microsoft.com/office/word/2010/wordprocessingCanvas" xmlns:cx="http://schemas.microsoft.com/office/drawing/2014/chartex" xmlns:cx1="http://schemas.microsoft.com/office/drawing/2015/9/8/chartex" xmlns:cx2="http://schemas.microsoft.com/office/drawing/2015/10/21/chartex" xmlns:mc="http://schemas.openxmlformats.org/markup-compatibility/2006" xmlns:o="urn:schemas-microsoft-com:office:office" xmlns:r="http://schemas.openxmlformats.org/officeDocument/2006/relationships" xmlns:m="http://schemas.openxmlformats.org/officeDocument/2006/math" xmlns:v="urn:schemas-microsoft-com:vml" xmlns:wp14="http://schemas.microsoft.com/office/word/2010/wordprocessingDrawing" xmlns:wp="http://schemas.openxmlformats.org/drawingml/2006/wordprocessingDrawing" xmlns:w10="urn:schemas-microsoft-com:office:word" xmlns:w="http://schemas.openxmlformats.org/wordprocessingml/2006/main" xmlns:w14="http://schemas.microsoft.com/office/word/2010/wordml" xmlns:w15="http://schemas.microsoft.com/office/word/2012/wordml" xmlns:w16se="http://schemas.microsoft.com/office/word/2015/wordml/symex" xmlns:wpg="http://schemas.microsoft.com/office/word/2010/wordprocessingGroup" xmlns:wpi="http://schemas.microsoft.com/office/word/2010/wordprocessingInk" xmlns:wne="http://schemas.microsoft.com/office/word/2006/wordml" xmlns:wps="http://schemas.microsoft.com/office/word/2010/wordprocessingShape" mc:Ignorable="w14 w15 w16se wp14">
+<w:hdr xmlns:wpc="http://schemas.microsoft.com/office/word/2010/wordprocessingCanvas" xmlns:cx="http://schemas.microsoft.com/office/drawing/2014/chartex" xmlns:cx1="http://schemas.microsoft.com/office/drawing/2015/9/8/chartex" xmlns:mc="http://schemas.openxmlformats.org/markup-compatibility/2006" xmlns:o="urn:schemas-microsoft-com:office:office" xmlns:r="http://schemas.openxmlformats.org/officeDocument/2006/relationships" xmlns:m="http://schemas.openxmlformats.org/officeDocument/2006/math" xmlns:v="urn:schemas-microsoft-com:vml" xmlns:wp14="http://schemas.microsoft.com/office/word/2010/wordprocessingDrawing" xmlns:wp="http://schemas.openxmlformats.org/drawingml/2006/wordprocessingDrawing" xmlns:w10="urn:schemas-microsoft-com:office:word" xmlns:w="http://schemas.openxmlformats.org/wordprocessingml/2006/main" xmlns:w14="http://schemas.microsoft.com/office/word/2010/wordml" xmlns:w15="http://schemas.microsoft.com/office/word/2012/wordml" xmlns:w16se="http://schemas.microsoft.com/office/word/2015/wordml/symex" xmlns:wpg="http://schemas.microsoft.com/office/word/2010/wordprocessingGroup" xmlns:wpi="http://schemas.microsoft.com/office/word/2010/wordprocessingInk" xmlns:wne="http://schemas.microsoft.com/office/word/2006/wordml" xmlns:wps="http://schemas.microsoft.com/office/word/2010/wordprocessingShape" mc:Ignorable="w14 w15 w16se wp14">
   <w:p>
     <w:pPr>
       <w:pStyle w:val="Header"/>
@@ -350,7 +378,7 @@
 </file>
 
 <file path=word/header3.xml><?xml version="1.0" encoding="utf-8"?>
-<w:hdr xmlns:wpc="http://schemas.microsoft.com/office/word/2010/wordprocessingCanvas" xmlns:cx="http://schemas.microsoft.com/office/drawing/2014/chartex" xmlns:cx1="http://schemas.microsoft.com/office/drawing/2015/9/8/chartex" xmlns:cx2="http://schemas.microsoft.com/office/drawing/2015/10/21/chartex" xmlns:mc="http://schemas.openxmlformats.org/markup-compatibility/2006" xmlns:o="urn:schemas-microsoft-com:office:office" xmlns:r="http://schemas.openxmlformats.org/officeDocument/2006/relationships" xmlns:m="http://schemas.openxmlformats.org/officeDocument/2006/math" xmlns:v="urn:schemas-microsoft-com:vml" xmlns:wp14="http://schemas.microsoft.com/office/word/2010/wordprocessingDrawing" xmlns:wp="http://schemas.openxmlformats.org/drawingml/2006/wordprocessingDrawing" xmlns:w10="urn:schemas-microsoft-com:office:word" xmlns:w="http://schemas.openxmlformats.org/wordprocessingml/2006/main" xmlns:w14="http://schemas.microsoft.com/office/word/2010/wordml" xmlns:w15="http://schemas.microsoft.com/office/word/2012/wordml" xmlns:w16se="http://schemas.microsoft.com/office/word/2015/wordml/symex" xmlns:wpg="http://schemas.microsoft.com/office/word/2010/wordprocessingGroup" xmlns:wpi="http://schemas.microsoft.com/office/word/2010/wordprocessingInk" xmlns:wne="http://schemas.microsoft.com/office/word/2006/wordml" xmlns:wps="http://schemas.microsoft.com/office/word/2010/wordprocessingShape" mc:Ignorable="w14 w15 w16se wp14">
+<w:hdr xmlns:wpc="http://schemas.microsoft.com/office/word/2010/wordprocessingCanvas" xmlns:cx="http://schemas.microsoft.com/office/drawing/2014/chartex" xmlns:cx1="http://schemas.microsoft.com/office/drawing/2015/9/8/chartex" xmlns:mc="http://schemas.openxmlformats.org/markup-compatibility/2006" xmlns:o="urn:schemas-microsoft-com:office:office" xmlns:r="http://schemas.openxmlformats.org/officeDocument/2006/relationships" xmlns:m="http://schemas.openxmlformats.org/officeDocument/2006/math" xmlns:v="urn:schemas-microsoft-com:vml" xmlns:wp14="http://schemas.microsoft.com/office/word/2010/wordprocessingDrawing" xmlns:wp="http://schemas.openxmlformats.org/drawingml/2006/wordprocessingDrawing" xmlns:w10="urn:schemas-microsoft-com:office:word" xmlns:w="http://schemas.openxmlformats.org/wordprocessingml/2006/main" xmlns:w14="http://schemas.microsoft.com/office/word/2010/wordml" xmlns:w15="http://schemas.microsoft.com/office/word/2012/wordml" xmlns:w16se="http://schemas.microsoft.com/office/word/2015/wordml/symex" xmlns:wpg="http://schemas.microsoft.com/office/word/2010/wordprocessingGroup" xmlns:wpi="http://schemas.microsoft.com/office/word/2010/wordprocessingInk" xmlns:wne="http://schemas.microsoft.com/office/word/2006/wordml" xmlns:wps="http://schemas.microsoft.com/office/word/2010/wordprocessingShape" mc:Ignorable="w14 w15 w16se wp14">
   <w:p>
     <w:pPr>
       <w:pStyle w:val="Header"/>
@@ -370,7 +398,7 @@
     </w:rPrDefault>
     <w:pPrDefault/>
   </w:docDefaults>
-  <w:latentStyles w:defLockedState="0" w:defUIPriority="99" w:defSemiHidden="0" w:defUnhideWhenUsed="0" w:defQFormat="0" w:count="372">
+  <w:latentStyles w:defLockedState="0" w:defUIPriority="99" w:defSemiHidden="0" w:defUnhideWhenUsed="0" w:defQFormat="0" w:count="371">
     <w:lsdException w:name="Normal" w:uiPriority="0" w:qFormat="1"/>
     <w:lsdException w:name="heading 1" w:uiPriority="9" w:qFormat="1"/>
     <w:lsdException w:name="heading 2" w:semiHidden="1" w:uiPriority="9" w:unhideWhenUsed="1" w:qFormat="1"/>
@@ -742,7 +770,6 @@
     <w:lsdException w:name="List Table 5 Dark Accent 6" w:uiPriority="50"/>
     <w:lsdException w:name="List Table 6 Colorful Accent 6" w:uiPriority="51"/>
     <w:lsdException w:name="List Table 7 Colorful Accent 6" w:uiPriority="52"/>
-    <w:lsdException w:name="Mention" w:semiHidden="1" w:unhideWhenUsed="1"/>
   </w:latentStyles>
   <w:style w:type="paragraph" w:default="1" w:styleId="Normal">
     <w:name w:val="Normal"/>

</xml_diff>